<commit_message>
Adding module 3.3 Assignmet
</commit_message>
<xml_diff>
--- a/module-3/Dingeto-module 3.2 Assignment.docx
+++ b/module-3/Dingeto-module 3.2 Assignment.docx
@@ -26,16 +26,15 @@
       </w:hyperlink>
     </w:p>
     <w:p>
-      <w:proofErr w:type="gramStart"/>
-      <w:r>
-        <w:t>girmadingeto.github.io./</w:t>
-      </w:r>
-      <w:proofErr w:type="gramEnd"/>
-      <w:r>
-        <w:t>csd-340/</w:t>
-      </w:r>
+      <w:hyperlink r:id="rId5" w:history="1">
+        <w:r>
+          <w:rPr>
+            <w:rStyle w:val="Hyperlink"/>
+          </w:rPr>
+          <w:t>https://girmadingeto.github.io/csd-340/</w:t>
+        </w:r>
+      </w:hyperlink>
     </w:p>
-    <w:p/>
     <w:p>
       <w:pPr>
         <w:pStyle w:val="NormalWeb"/>
@@ -62,7 +61,7 @@
                     </pic:cNvPicPr>
                   </pic:nvPicPr>
                   <pic:blipFill>
-                    <a:blip r:embed="rId5">
+                    <a:blip r:embed="rId6">
                       <a:extLst>
                         <a:ext uri="{28A0092B-C50C-407E-A947-70E740481C1C}">
                           <a14:useLocalDpi xmlns:a14="http://schemas.microsoft.com/office/drawing/2010/main" val="0"/>
@@ -125,7 +124,7 @@
                     </pic:cNvPicPr>
                   </pic:nvPicPr>
                   <pic:blipFill>
-                    <a:blip r:embed="rId6">
+                    <a:blip r:embed="rId7">
                       <a:extLst>
                         <a:ext uri="{28A0092B-C50C-407E-A947-70E740481C1C}">
                           <a14:useLocalDpi xmlns:a14="http://schemas.microsoft.com/office/drawing/2010/main" val="0"/>
@@ -186,7 +185,7 @@
                     </pic:cNvPicPr>
                   </pic:nvPicPr>
                   <pic:blipFill>
-                    <a:blip r:embed="rId7">
+                    <a:blip r:embed="rId8">
                       <a:extLst>
                         <a:ext uri="{28A0092B-C50C-407E-A947-70E740481C1C}">
                           <a14:useLocalDpi xmlns:a14="http://schemas.microsoft.com/office/drawing/2010/main" val="0"/>

</xml_diff>